<commit_message>
Fix format of midterm test
</commit_message>
<xml_diff>
--- a/object_oriented_programming/temp_midterm_test.docx
+++ b/object_oriented_programming/temp_midterm_test.docx
@@ -7,8 +7,173 @@
         <w:ind w:firstLine="0"/>
         <w:jc w:val="both"/>
       </w:pPr>
-      <w:r>
-        <w:t>Vận dụng phương pháp lập trình hướng đối tượng, viết chương trình quản lý xe máy, với các yêu cầu sau:</w:t>
+      <w:proofErr w:type="spellStart"/>
+      <w:r>
+        <w:t>Vận</w:t>
+      </w:r>
+      <w:proofErr w:type="spellEnd"/>
+      <w:r>
+        <w:t xml:space="preserve"> </w:t>
+      </w:r>
+      <w:proofErr w:type="spellStart"/>
+      <w:r>
+        <w:t>dụng</w:t>
+      </w:r>
+      <w:proofErr w:type="spellEnd"/>
+      <w:r>
+        <w:t xml:space="preserve"> </w:t>
+      </w:r>
+      <w:proofErr w:type="spellStart"/>
+      <w:r>
+        <w:t>phương</w:t>
+      </w:r>
+      <w:proofErr w:type="spellEnd"/>
+      <w:r>
+        <w:t xml:space="preserve"> </w:t>
+      </w:r>
+      <w:proofErr w:type="spellStart"/>
+      <w:r>
+        <w:t>pháp</w:t>
+      </w:r>
+      <w:proofErr w:type="spellEnd"/>
+      <w:r>
+        <w:t xml:space="preserve"> </w:t>
+      </w:r>
+      <w:proofErr w:type="spellStart"/>
+      <w:r>
+        <w:t>lập</w:t>
+      </w:r>
+      <w:proofErr w:type="spellEnd"/>
+      <w:r>
+        <w:t xml:space="preserve"> </w:t>
+      </w:r>
+      <w:proofErr w:type="spellStart"/>
+      <w:r>
+        <w:t>trình</w:t>
+      </w:r>
+      <w:proofErr w:type="spellEnd"/>
+      <w:r>
+        <w:t xml:space="preserve"> </w:t>
+      </w:r>
+      <w:proofErr w:type="spellStart"/>
+      <w:r>
+        <w:t>hướng</w:t>
+      </w:r>
+      <w:proofErr w:type="spellEnd"/>
+      <w:r>
+        <w:t xml:space="preserve"> </w:t>
+      </w:r>
+      <w:proofErr w:type="spellStart"/>
+      <w:r>
+        <w:t>đối</w:t>
+      </w:r>
+      <w:proofErr w:type="spellEnd"/>
+      <w:r>
+        <w:t xml:space="preserve"> </w:t>
+      </w:r>
+      <w:proofErr w:type="spellStart"/>
+      <w:r>
+        <w:t>tượng</w:t>
+      </w:r>
+      <w:proofErr w:type="spellEnd"/>
+      <w:r>
+        <w:t xml:space="preserve">, </w:t>
+      </w:r>
+      <w:proofErr w:type="spellStart"/>
+      <w:r>
+        <w:t>viết</w:t>
+      </w:r>
+      <w:proofErr w:type="spellEnd"/>
+      <w:r>
+        <w:t xml:space="preserve"> </w:t>
+      </w:r>
+      <w:proofErr w:type="spellStart"/>
+      <w:r>
+        <w:t>chương</w:t>
+      </w:r>
+      <w:proofErr w:type="spellEnd"/>
+      <w:r>
+        <w:t xml:space="preserve"> </w:t>
+      </w:r>
+      <w:proofErr w:type="spellStart"/>
+      <w:r>
+        <w:t>trình</w:t>
+      </w:r>
+      <w:proofErr w:type="spellEnd"/>
+      <w:r>
+        <w:t xml:space="preserve"> </w:t>
+      </w:r>
+      <w:proofErr w:type="spellStart"/>
+      <w:r>
+        <w:t>quản</w:t>
+      </w:r>
+      <w:proofErr w:type="spellEnd"/>
+      <w:r>
+        <w:t xml:space="preserve"> </w:t>
+      </w:r>
+      <w:proofErr w:type="spellStart"/>
+      <w:r>
+        <w:t>lý</w:t>
+      </w:r>
+      <w:proofErr w:type="spellEnd"/>
+      <w:r>
+        <w:t xml:space="preserve"> </w:t>
+      </w:r>
+      <w:proofErr w:type="spellStart"/>
+      <w:r>
+        <w:t>xe</w:t>
+      </w:r>
+      <w:proofErr w:type="spellEnd"/>
+      <w:r>
+        <w:t xml:space="preserve"> </w:t>
+      </w:r>
+      <w:proofErr w:type="spellStart"/>
+      <w:r>
+        <w:t>máy</w:t>
+      </w:r>
+      <w:proofErr w:type="spellEnd"/>
+      <w:r>
+        <w:t xml:space="preserve"> </w:t>
+      </w:r>
+      <w:proofErr w:type="spellStart"/>
+      <w:r>
+        <w:t>với</w:t>
+      </w:r>
+      <w:proofErr w:type="spellEnd"/>
+      <w:r>
+        <w:t xml:space="preserve"> </w:t>
+      </w:r>
+      <w:proofErr w:type="spellStart"/>
+      <w:r>
+        <w:t>các</w:t>
+      </w:r>
+      <w:proofErr w:type="spellEnd"/>
+      <w:r>
+        <w:t xml:space="preserve"> </w:t>
+      </w:r>
+      <w:proofErr w:type="spellStart"/>
+      <w:r>
+        <w:t>yêu</w:t>
+      </w:r>
+      <w:proofErr w:type="spellEnd"/>
+      <w:r>
+        <w:t xml:space="preserve"> </w:t>
+      </w:r>
+      <w:proofErr w:type="spellStart"/>
+      <w:r>
+        <w:t>cầu</w:t>
+      </w:r>
+      <w:proofErr w:type="spellEnd"/>
+      <w:r>
+        <w:t xml:space="preserve"> </w:t>
+      </w:r>
+      <w:proofErr w:type="spellStart"/>
+      <w:r>
+        <w:t>sau</w:t>
+      </w:r>
+      <w:proofErr w:type="spellEnd"/>
+      <w:r>
+        <w:t>:</w:t>
       </w:r>
     </w:p>
     <w:p>
@@ -17,7 +182,47 @@
         <w:jc w:val="both"/>
       </w:pPr>
       <w:r>
-        <w:t>1. Cài đặt các lớp đối tượng (6đ)</w:t>
+        <w:t xml:space="preserve">1. Cài </w:t>
+      </w:r>
+      <w:proofErr w:type="spellStart"/>
+      <w:r>
+        <w:t>đặt</w:t>
+      </w:r>
+      <w:proofErr w:type="spellEnd"/>
+      <w:r>
+        <w:t xml:space="preserve"> </w:t>
+      </w:r>
+      <w:proofErr w:type="spellStart"/>
+      <w:r>
+        <w:t>các</w:t>
+      </w:r>
+      <w:proofErr w:type="spellEnd"/>
+      <w:r>
+        <w:t xml:space="preserve"> </w:t>
+      </w:r>
+      <w:proofErr w:type="spellStart"/>
+      <w:r>
+        <w:t>lớp</w:t>
+      </w:r>
+      <w:proofErr w:type="spellEnd"/>
+      <w:r>
+        <w:t xml:space="preserve"> </w:t>
+      </w:r>
+      <w:proofErr w:type="spellStart"/>
+      <w:r>
+        <w:t>đối</w:t>
+      </w:r>
+      <w:proofErr w:type="spellEnd"/>
+      <w:r>
+        <w:t xml:space="preserve"> </w:t>
+      </w:r>
+      <w:proofErr w:type="spellStart"/>
+      <w:r>
+        <w:t>tượng</w:t>
+      </w:r>
+      <w:proofErr w:type="spellEnd"/>
+      <w:r>
+        <w:t xml:space="preserve"> (6đ)</w:t>
       </w:r>
     </w:p>
     <w:p>
@@ -26,8 +231,29 @@
         <w:jc w:val="both"/>
       </w:pPr>
       <w:r>
-        <w:t>1. Cài đặt lớp XeMay</w:t>
-      </w:r>
+        <w:t xml:space="preserve">1. Cài </w:t>
+      </w:r>
+      <w:proofErr w:type="spellStart"/>
+      <w:r>
+        <w:t>đặt</w:t>
+      </w:r>
+      <w:proofErr w:type="spellEnd"/>
+      <w:r>
+        <w:t xml:space="preserve"> </w:t>
+      </w:r>
+      <w:proofErr w:type="spellStart"/>
+      <w:r>
+        <w:t>lớp</w:t>
+      </w:r>
+      <w:proofErr w:type="spellEnd"/>
+      <w:r>
+        <w:t xml:space="preserve"> </w:t>
+      </w:r>
+      <w:proofErr w:type="spellStart"/>
+      <w:r>
+        <w:t>XeMay</w:t>
+      </w:r>
+      <w:proofErr w:type="spellEnd"/>
     </w:p>
     <w:p>
       <w:pPr>
@@ -35,7 +261,175 @@
         <w:jc w:val="both"/>
       </w:pPr>
       <w:r>
-        <w:t>- Các thuộc tính: Biển số, năm sản xuất, giá bán. Sinh viên tự xác định kiểu dữ liệu phù hợp với mỗi thuộc tính (1đ)</w:t>
+        <w:t xml:space="preserve">- Các </w:t>
+      </w:r>
+      <w:proofErr w:type="spellStart"/>
+      <w:r>
+        <w:t>thuộc</w:t>
+      </w:r>
+      <w:proofErr w:type="spellEnd"/>
+      <w:r>
+        <w:t xml:space="preserve"> </w:t>
+      </w:r>
+      <w:proofErr w:type="spellStart"/>
+      <w:r>
+        <w:t>tính</w:t>
+      </w:r>
+      <w:proofErr w:type="spellEnd"/>
+      <w:r>
+        <w:t xml:space="preserve">: Biển </w:t>
+      </w:r>
+      <w:proofErr w:type="spellStart"/>
+      <w:r>
+        <w:t>số</w:t>
+      </w:r>
+      <w:proofErr w:type="spellEnd"/>
+      <w:r>
+        <w:t xml:space="preserve">, </w:t>
+      </w:r>
+      <w:proofErr w:type="spellStart"/>
+      <w:r>
+        <w:t>năm</w:t>
+      </w:r>
+      <w:proofErr w:type="spellEnd"/>
+      <w:r>
+        <w:t xml:space="preserve"> </w:t>
+      </w:r>
+      <w:proofErr w:type="spellStart"/>
+      <w:r>
+        <w:t>sản</w:t>
+      </w:r>
+      <w:proofErr w:type="spellEnd"/>
+      <w:r>
+        <w:t xml:space="preserve"> </w:t>
+      </w:r>
+      <w:proofErr w:type="spellStart"/>
+      <w:r>
+        <w:t>xuất</w:t>
+      </w:r>
+      <w:proofErr w:type="spellEnd"/>
+      <w:r>
+        <w:t xml:space="preserve">, </w:t>
+      </w:r>
+      <w:proofErr w:type="spellStart"/>
+      <w:r>
+        <w:t>giá</w:t>
+      </w:r>
+      <w:proofErr w:type="spellEnd"/>
+      <w:r>
+        <w:t xml:space="preserve"> </w:t>
+      </w:r>
+      <w:proofErr w:type="spellStart"/>
+      <w:r>
+        <w:t>bán</w:t>
+      </w:r>
+      <w:proofErr w:type="spellEnd"/>
+      <w:r>
+        <w:t xml:space="preserve">. Sinh </w:t>
+      </w:r>
+      <w:proofErr w:type="spellStart"/>
+      <w:r>
+        <w:t>viên</w:t>
+      </w:r>
+      <w:proofErr w:type="spellEnd"/>
+      <w:r>
+        <w:t xml:space="preserve"> </w:t>
+      </w:r>
+      <w:proofErr w:type="spellStart"/>
+      <w:r>
+        <w:t>tự</w:t>
+      </w:r>
+      <w:proofErr w:type="spellEnd"/>
+      <w:r>
+        <w:t xml:space="preserve"> </w:t>
+      </w:r>
+      <w:proofErr w:type="spellStart"/>
+      <w:r>
+        <w:t>xác</w:t>
+      </w:r>
+      <w:proofErr w:type="spellEnd"/>
+      <w:r>
+        <w:t xml:space="preserve"> </w:t>
+      </w:r>
+      <w:proofErr w:type="spellStart"/>
+      <w:r>
+        <w:t>định</w:t>
+      </w:r>
+      <w:proofErr w:type="spellEnd"/>
+      <w:r>
+        <w:t xml:space="preserve"> </w:t>
+      </w:r>
+      <w:proofErr w:type="spellStart"/>
+      <w:r>
+        <w:t>kiểu</w:t>
+      </w:r>
+      <w:proofErr w:type="spellEnd"/>
+      <w:r>
+        <w:t xml:space="preserve"> </w:t>
+      </w:r>
+      <w:proofErr w:type="spellStart"/>
+      <w:r>
+        <w:t>dữ</w:t>
+      </w:r>
+      <w:proofErr w:type="spellEnd"/>
+      <w:r>
+        <w:t xml:space="preserve"> </w:t>
+      </w:r>
+      <w:proofErr w:type="spellStart"/>
+      <w:r>
+        <w:t>liệu</w:t>
+      </w:r>
+      <w:proofErr w:type="spellEnd"/>
+      <w:r>
+        <w:t xml:space="preserve"> </w:t>
+      </w:r>
+      <w:proofErr w:type="spellStart"/>
+      <w:r>
+        <w:t>phù</w:t>
+      </w:r>
+      <w:proofErr w:type="spellEnd"/>
+      <w:r>
+        <w:t xml:space="preserve"> </w:t>
+      </w:r>
+      <w:proofErr w:type="spellStart"/>
+      <w:r>
+        <w:t>hợp</w:t>
+      </w:r>
+      <w:proofErr w:type="spellEnd"/>
+      <w:r>
+        <w:t xml:space="preserve"> </w:t>
+      </w:r>
+      <w:proofErr w:type="spellStart"/>
+      <w:r>
+        <w:t>với</w:t>
+      </w:r>
+      <w:proofErr w:type="spellEnd"/>
+      <w:r>
+        <w:t xml:space="preserve"> </w:t>
+      </w:r>
+      <w:proofErr w:type="spellStart"/>
+      <w:r>
+        <w:t>mỗi</w:t>
+      </w:r>
+      <w:proofErr w:type="spellEnd"/>
+      <w:r>
+        <w:t xml:space="preserve"> </w:t>
+      </w:r>
+      <w:proofErr w:type="spellStart"/>
+      <w:r>
+        <w:t>thuộc</w:t>
+      </w:r>
+      <w:proofErr w:type="spellEnd"/>
+      <w:r>
+        <w:t xml:space="preserve"> </w:t>
+      </w:r>
+      <w:proofErr w:type="spellStart"/>
+      <w:r>
+        <w:t>tính</w:t>
+      </w:r>
+      <w:proofErr w:type="spellEnd"/>
+      <w:r>
+        <w:t xml:space="preserve"> (1đ)</w:t>
       </w:r>
     </w:p>
     <w:p>
@@ -44,7 +438,23 @@
         <w:jc w:val="both"/>
       </w:pPr>
       <w:r>
-        <w:t>- Các phương thức: (2đ)</w:t>
+        <w:t xml:space="preserve">- Các </w:t>
+      </w:r>
+      <w:proofErr w:type="spellStart"/>
+      <w:r>
+        <w:t>phương</w:t>
+      </w:r>
+      <w:proofErr w:type="spellEnd"/>
+      <w:r>
+        <w:t xml:space="preserve"> </w:t>
+      </w:r>
+      <w:proofErr w:type="spellStart"/>
+      <w:r>
+        <w:t>thức</w:t>
+      </w:r>
+      <w:proofErr w:type="spellEnd"/>
+      <w:r>
+        <w:t>: (2đ)</w:t>
       </w:r>
     </w:p>
     <w:p>
@@ -54,8 +464,109 @@
       </w:pPr>
       <w:r>
         <w:tab/>
-        <w:t>+ Phương thức thiết lập dùng để khởi tạo các giá trị cho đối tượng</w:t>
-      </w:r>
+        <w:t xml:space="preserve">+ Phương </w:t>
+      </w:r>
+      <w:proofErr w:type="spellStart"/>
+      <w:r>
+        <w:t>thức</w:t>
+      </w:r>
+      <w:proofErr w:type="spellEnd"/>
+      <w:r>
+        <w:t xml:space="preserve"> </w:t>
+      </w:r>
+      <w:proofErr w:type="spellStart"/>
+      <w:r>
+        <w:t>thiết</w:t>
+      </w:r>
+      <w:proofErr w:type="spellEnd"/>
+      <w:r>
+        <w:t xml:space="preserve"> </w:t>
+      </w:r>
+      <w:proofErr w:type="spellStart"/>
+      <w:r>
+        <w:t>lập</w:t>
+      </w:r>
+      <w:proofErr w:type="spellEnd"/>
+      <w:r>
+        <w:t xml:space="preserve"> </w:t>
+      </w:r>
+      <w:proofErr w:type="spellStart"/>
+      <w:r>
+        <w:t>dùng</w:t>
+      </w:r>
+      <w:proofErr w:type="spellEnd"/>
+      <w:r>
+        <w:t xml:space="preserve"> </w:t>
+      </w:r>
+      <w:proofErr w:type="spellStart"/>
+      <w:r>
+        <w:t>để</w:t>
+      </w:r>
+      <w:proofErr w:type="spellEnd"/>
+      <w:r>
+        <w:t xml:space="preserve"> </w:t>
+      </w:r>
+      <w:proofErr w:type="spellStart"/>
+      <w:r>
+        <w:t>khởi</w:t>
+      </w:r>
+      <w:proofErr w:type="spellEnd"/>
+      <w:r>
+        <w:t xml:space="preserve"> </w:t>
+      </w:r>
+      <w:proofErr w:type="spellStart"/>
+      <w:r>
+        <w:t>tạo</w:t>
+      </w:r>
+      <w:proofErr w:type="spellEnd"/>
+      <w:r>
+        <w:t xml:space="preserve"> </w:t>
+      </w:r>
+      <w:proofErr w:type="spellStart"/>
+      <w:r>
+        <w:t>các</w:t>
+      </w:r>
+      <w:proofErr w:type="spellEnd"/>
+      <w:r>
+        <w:t xml:space="preserve"> </w:t>
+      </w:r>
+      <w:proofErr w:type="spellStart"/>
+      <w:r>
+        <w:t>giá</w:t>
+      </w:r>
+      <w:proofErr w:type="spellEnd"/>
+      <w:r>
+        <w:t xml:space="preserve"> </w:t>
+      </w:r>
+      <w:proofErr w:type="spellStart"/>
+      <w:r>
+        <w:t>trị</w:t>
+      </w:r>
+      <w:proofErr w:type="spellEnd"/>
+      <w:r>
+        <w:t xml:space="preserve"> </w:t>
+      </w:r>
+      <w:proofErr w:type="spellStart"/>
+      <w:r>
+        <w:t>cho</w:t>
+      </w:r>
+      <w:proofErr w:type="spellEnd"/>
+      <w:r>
+        <w:t xml:space="preserve"> </w:t>
+      </w:r>
+      <w:proofErr w:type="spellStart"/>
+      <w:r>
+        <w:t>đối</w:t>
+      </w:r>
+      <w:proofErr w:type="spellEnd"/>
+      <w:r>
+        <w:t xml:space="preserve"> </w:t>
+      </w:r>
+      <w:proofErr w:type="spellStart"/>
+      <w:r>
+        <w:t>tượng</w:t>
+      </w:r>
+      <w:proofErr w:type="spellEnd"/>
     </w:p>
     <w:p>
       <w:pPr>
@@ -64,8 +575,77 @@
       </w:pPr>
       <w:r>
         <w:tab/>
-        <w:t>+ Nhap() dùng để nhập thông tin xe từ bàn phím</w:t>
-      </w:r>
+        <w:t xml:space="preserve">+ </w:t>
+      </w:r>
+      <w:proofErr w:type="spellStart"/>
+      <w:r>
+        <w:t>Nhap</w:t>
+      </w:r>
+      <w:proofErr w:type="spellEnd"/>
+      <w:r>
+        <w:t xml:space="preserve">() </w:t>
+      </w:r>
+      <w:proofErr w:type="spellStart"/>
+      <w:r>
+        <w:t>dùng</w:t>
+      </w:r>
+      <w:proofErr w:type="spellEnd"/>
+      <w:r>
+        <w:t xml:space="preserve"> </w:t>
+      </w:r>
+      <w:proofErr w:type="spellStart"/>
+      <w:r>
+        <w:t>để</w:t>
+      </w:r>
+      <w:proofErr w:type="spellEnd"/>
+      <w:r>
+        <w:t xml:space="preserve"> </w:t>
+      </w:r>
+      <w:proofErr w:type="spellStart"/>
+      <w:r>
+        <w:t>nhập</w:t>
+      </w:r>
+      <w:proofErr w:type="spellEnd"/>
+      <w:r>
+        <w:t xml:space="preserve"> </w:t>
+      </w:r>
+      <w:proofErr w:type="spellStart"/>
+      <w:r>
+        <w:t>thông</w:t>
+      </w:r>
+      <w:proofErr w:type="spellEnd"/>
+      <w:r>
+        <w:t xml:space="preserve"> tin </w:t>
+      </w:r>
+      <w:proofErr w:type="spellStart"/>
+      <w:r>
+        <w:t>xe</w:t>
+      </w:r>
+      <w:proofErr w:type="spellEnd"/>
+      <w:r>
+        <w:t xml:space="preserve"> </w:t>
+      </w:r>
+      <w:proofErr w:type="spellStart"/>
+      <w:r>
+        <w:t>từ</w:t>
+      </w:r>
+      <w:proofErr w:type="spellEnd"/>
+      <w:r>
+        <w:t xml:space="preserve"> </w:t>
+      </w:r>
+      <w:proofErr w:type="spellStart"/>
+      <w:r>
+        <w:t>bàn</w:t>
+      </w:r>
+      <w:proofErr w:type="spellEnd"/>
+      <w:r>
+        <w:t xml:space="preserve"> </w:t>
+      </w:r>
+      <w:proofErr w:type="spellStart"/>
+      <w:r>
+        <w:t>phím</w:t>
+      </w:r>
+      <w:proofErr w:type="spellEnd"/>
     </w:p>
     <w:p>
       <w:pPr>
@@ -74,8 +654,45 @@
       </w:pPr>
       <w:r>
         <w:tab/>
-        <w:t>+ Xuat() dùng để in thông tin xe</w:t>
-      </w:r>
+        <w:t xml:space="preserve">+ </w:t>
+      </w:r>
+      <w:proofErr w:type="spellStart"/>
+      <w:r>
+        <w:t>Xuat</w:t>
+      </w:r>
+      <w:proofErr w:type="spellEnd"/>
+      <w:r>
+        <w:t xml:space="preserve">() </w:t>
+      </w:r>
+      <w:proofErr w:type="spellStart"/>
+      <w:r>
+        <w:t>dùng</w:t>
+      </w:r>
+      <w:proofErr w:type="spellEnd"/>
+      <w:r>
+        <w:t xml:space="preserve"> </w:t>
+      </w:r>
+      <w:proofErr w:type="spellStart"/>
+      <w:r>
+        <w:t>để</w:t>
+      </w:r>
+      <w:proofErr w:type="spellEnd"/>
+      <w:r>
+        <w:t xml:space="preserve"> in </w:t>
+      </w:r>
+      <w:proofErr w:type="spellStart"/>
+      <w:r>
+        <w:t>thông</w:t>
+      </w:r>
+      <w:proofErr w:type="spellEnd"/>
+      <w:r>
+        <w:t xml:space="preserve"> tin </w:t>
+      </w:r>
+      <w:proofErr w:type="spellStart"/>
+      <w:r>
+        <w:t>xe</w:t>
+      </w:r>
+      <w:proofErr w:type="spellEnd"/>
     </w:p>
     <w:p>
       <w:pPr>
@@ -84,8 +701,136 @@
       </w:pPr>
       <w:r>
         <w:tab/>
-        <w:t>+ ThoiHanSuDung(), là phương thức ảo tính thòi hạn sử dụng (số năm) còn lại của xe</w:t>
-      </w:r>
+        <w:t xml:space="preserve">+ </w:t>
+      </w:r>
+      <w:proofErr w:type="spellStart"/>
+      <w:r>
+        <w:t>ThoiHanSuDung</w:t>
+      </w:r>
+      <w:proofErr w:type="spellEnd"/>
+      <w:r>
+        <w:t xml:space="preserve">(), </w:t>
+      </w:r>
+      <w:proofErr w:type="spellStart"/>
+      <w:r>
+        <w:t>là</w:t>
+      </w:r>
+      <w:proofErr w:type="spellEnd"/>
+      <w:r>
+        <w:t xml:space="preserve"> </w:t>
+      </w:r>
+      <w:proofErr w:type="spellStart"/>
+      <w:r>
+        <w:t>phương</w:t>
+      </w:r>
+      <w:proofErr w:type="spellEnd"/>
+      <w:r>
+        <w:t xml:space="preserve"> </w:t>
+      </w:r>
+      <w:proofErr w:type="spellStart"/>
+      <w:r>
+        <w:t>thức</w:t>
+      </w:r>
+      <w:proofErr w:type="spellEnd"/>
+      <w:r>
+        <w:t xml:space="preserve"> </w:t>
+      </w:r>
+      <w:proofErr w:type="spellStart"/>
+      <w:r>
+        <w:t>ảo</w:t>
+      </w:r>
+      <w:proofErr w:type="spellEnd"/>
+      <w:r>
+        <w:t xml:space="preserve"> </w:t>
+      </w:r>
+      <w:proofErr w:type="spellStart"/>
+      <w:r>
+        <w:t>tính</w:t>
+      </w:r>
+      <w:proofErr w:type="spellEnd"/>
+      <w:r>
+        <w:t xml:space="preserve"> </w:t>
+      </w:r>
+      <w:proofErr w:type="spellStart"/>
+      <w:r>
+        <w:t>thờ</w:t>
+      </w:r>
+      <w:r>
+        <w:t>i</w:t>
+      </w:r>
+      <w:proofErr w:type="spellEnd"/>
+      <w:r>
+        <w:t xml:space="preserve"> h</w:t>
+      </w:r>
+      <w:proofErr w:type="spellStart"/>
+      <w:r>
+        <w:t>ạn</w:t>
+      </w:r>
+      <w:proofErr w:type="spellEnd"/>
+      <w:r>
+        <w:t xml:space="preserve"> </w:t>
+      </w:r>
+      <w:proofErr w:type="spellStart"/>
+      <w:r>
+        <w:t>sử</w:t>
+      </w:r>
+      <w:proofErr w:type="spellEnd"/>
+      <w:r>
+        <w:t xml:space="preserve"> </w:t>
+      </w:r>
+      <w:proofErr w:type="spellStart"/>
+      <w:r>
+        <w:t>dụng</w:t>
+      </w:r>
+      <w:proofErr w:type="spellEnd"/>
+      <w:r>
+        <w:t xml:space="preserve"> (</w:t>
+      </w:r>
+      <w:proofErr w:type="spellStart"/>
+      <w:r>
+        <w:t>số</w:t>
+      </w:r>
+      <w:proofErr w:type="spellEnd"/>
+      <w:r>
+        <w:t xml:space="preserve"> </w:t>
+      </w:r>
+      <w:proofErr w:type="spellStart"/>
+      <w:r>
+        <w:t>năm</w:t>
+      </w:r>
+      <w:proofErr w:type="spellEnd"/>
+      <w:r>
+        <w:t xml:space="preserve">) </w:t>
+      </w:r>
+      <w:proofErr w:type="spellStart"/>
+      <w:r>
+        <w:t>còn</w:t>
+      </w:r>
+      <w:proofErr w:type="spellEnd"/>
+      <w:r>
+        <w:t xml:space="preserve"> </w:t>
+      </w:r>
+      <w:proofErr w:type="spellStart"/>
+      <w:r>
+        <w:t>lại</w:t>
+      </w:r>
+      <w:proofErr w:type="spellEnd"/>
+      <w:r>
+        <w:t xml:space="preserve"> </w:t>
+      </w:r>
+      <w:proofErr w:type="spellStart"/>
+      <w:r>
+        <w:t>của</w:t>
+      </w:r>
+      <w:proofErr w:type="spellEnd"/>
+      <w:r>
+        <w:t xml:space="preserve"> </w:t>
+      </w:r>
+      <w:proofErr w:type="spellStart"/>
+      <w:r>
+        <w:t>xe</w:t>
+      </w:r>
+      <w:proofErr w:type="spellEnd"/>
     </w:p>
     <w:p>
       <w:pPr>
@@ -93,7 +838,135 @@
         <w:jc w:val="both"/>
       </w:pPr>
       <w:r>
-        <w:t>2. Cài đặt lớp XeDien kế thừa lớp XeMay và thêm các thuộc tính, phương thức riêng sau:</w:t>
+        <w:t xml:space="preserve">2. Cài </w:t>
+      </w:r>
+      <w:proofErr w:type="spellStart"/>
+      <w:r>
+        <w:t>đặt</w:t>
+      </w:r>
+      <w:proofErr w:type="spellEnd"/>
+      <w:r>
+        <w:t xml:space="preserve"> </w:t>
+      </w:r>
+      <w:proofErr w:type="spellStart"/>
+      <w:r>
+        <w:t>lớp</w:t>
+      </w:r>
+      <w:proofErr w:type="spellEnd"/>
+      <w:r>
+        <w:t xml:space="preserve"> </w:t>
+      </w:r>
+      <w:proofErr w:type="spellStart"/>
+      <w:r>
+        <w:t>XeDien</w:t>
+      </w:r>
+      <w:proofErr w:type="spellEnd"/>
+      <w:r>
+        <w:t xml:space="preserve"> </w:t>
+      </w:r>
+      <w:proofErr w:type="spellStart"/>
+      <w:r>
+        <w:t>kế</w:t>
+      </w:r>
+      <w:proofErr w:type="spellEnd"/>
+      <w:r>
+        <w:t xml:space="preserve"> </w:t>
+      </w:r>
+      <w:proofErr w:type="spellStart"/>
+      <w:r>
+        <w:t>thừa</w:t>
+      </w:r>
+      <w:proofErr w:type="spellEnd"/>
+      <w:r>
+        <w:t xml:space="preserve"> </w:t>
+      </w:r>
+      <w:proofErr w:type="spellStart"/>
+      <w:r>
+        <w:t>lớp</w:t>
+      </w:r>
+      <w:proofErr w:type="spellEnd"/>
+      <w:r>
+        <w:t xml:space="preserve"> </w:t>
+      </w:r>
+      <w:proofErr w:type="spellStart"/>
+      <w:r>
+        <w:t>XeMay</w:t>
+      </w:r>
+      <w:proofErr w:type="spellEnd"/>
+      <w:r>
+        <w:t xml:space="preserve"> </w:t>
+      </w:r>
+      <w:proofErr w:type="spellStart"/>
+      <w:r>
+        <w:t>và</w:t>
+      </w:r>
+      <w:proofErr w:type="spellEnd"/>
+      <w:r>
+        <w:t xml:space="preserve"> </w:t>
+      </w:r>
+      <w:proofErr w:type="spellStart"/>
+      <w:r>
+        <w:t>thêm</w:t>
+      </w:r>
+      <w:proofErr w:type="spellEnd"/>
+      <w:r>
+        <w:t xml:space="preserve"> </w:t>
+      </w:r>
+      <w:proofErr w:type="spellStart"/>
+      <w:r>
+        <w:t>các</w:t>
+      </w:r>
+      <w:proofErr w:type="spellEnd"/>
+      <w:r>
+        <w:t xml:space="preserve"> </w:t>
+      </w:r>
+      <w:proofErr w:type="spellStart"/>
+      <w:r>
+        <w:t>thuộc</w:t>
+      </w:r>
+      <w:proofErr w:type="spellEnd"/>
+      <w:r>
+        <w:t xml:space="preserve"> </w:t>
+      </w:r>
+      <w:proofErr w:type="spellStart"/>
+      <w:r>
+        <w:t>tính</w:t>
+      </w:r>
+      <w:proofErr w:type="spellEnd"/>
+      <w:r>
+        <w:t xml:space="preserve">, </w:t>
+      </w:r>
+      <w:proofErr w:type="spellStart"/>
+      <w:r>
+        <w:t>phương</w:t>
+      </w:r>
+      <w:proofErr w:type="spellEnd"/>
+      <w:r>
+        <w:t xml:space="preserve"> </w:t>
+      </w:r>
+      <w:proofErr w:type="spellStart"/>
+      <w:r>
+        <w:t>thức</w:t>
+      </w:r>
+      <w:proofErr w:type="spellEnd"/>
+      <w:r>
+        <w:t xml:space="preserve"> </w:t>
+      </w:r>
+      <w:proofErr w:type="spellStart"/>
+      <w:r>
+        <w:t>riêng</w:t>
+      </w:r>
+      <w:proofErr w:type="spellEnd"/>
+      <w:r>
+        <w:t xml:space="preserve"> </w:t>
+      </w:r>
+      <w:proofErr w:type="spellStart"/>
+      <w:r>
+        <w:t>sau</w:t>
+      </w:r>
+      <w:proofErr w:type="spellEnd"/>
+      <w:r>
+        <w:t>:</w:t>
       </w:r>
     </w:p>
     <w:p>
@@ -102,7 +975,79 @@
         <w:jc w:val="both"/>
       </w:pPr>
       <w:r>
-        <w:t>- Các thuộc tính: công suất động cơ (đơn vị tính: Watt) (1đ)</w:t>
+        <w:t xml:space="preserve">- Các </w:t>
+      </w:r>
+      <w:proofErr w:type="spellStart"/>
+      <w:r>
+        <w:t>thuộc</w:t>
+      </w:r>
+      <w:proofErr w:type="spellEnd"/>
+      <w:r>
+        <w:t xml:space="preserve"> </w:t>
+      </w:r>
+      <w:proofErr w:type="spellStart"/>
+      <w:r>
+        <w:t>tính</w:t>
+      </w:r>
+      <w:proofErr w:type="spellEnd"/>
+      <w:r>
+        <w:t xml:space="preserve">: </w:t>
+      </w:r>
+      <w:proofErr w:type="spellStart"/>
+      <w:r>
+        <w:t>công</w:t>
+      </w:r>
+      <w:proofErr w:type="spellEnd"/>
+      <w:r>
+        <w:t xml:space="preserve"> </w:t>
+      </w:r>
+      <w:proofErr w:type="spellStart"/>
+      <w:r>
+        <w:t>suất</w:t>
+      </w:r>
+      <w:proofErr w:type="spellEnd"/>
+      <w:r>
+        <w:t xml:space="preserve"> </w:t>
+      </w:r>
+      <w:proofErr w:type="spellStart"/>
+      <w:r>
+        <w:t>động</w:t>
+      </w:r>
+      <w:proofErr w:type="spellEnd"/>
+      <w:r>
+        <w:t xml:space="preserve"> </w:t>
+      </w:r>
+      <w:proofErr w:type="spellStart"/>
+      <w:r>
+        <w:t>cơ</w:t>
+      </w:r>
+      <w:proofErr w:type="spellEnd"/>
+      <w:r>
+        <w:t xml:space="preserve"> (</w:t>
+      </w:r>
+      <w:proofErr w:type="spellStart"/>
+      <w:r>
+        <w:t>đơn</w:t>
+      </w:r>
+      <w:proofErr w:type="spellEnd"/>
+      <w:r>
+        <w:t xml:space="preserve"> </w:t>
+      </w:r>
+      <w:proofErr w:type="spellStart"/>
+      <w:r>
+        <w:t>vị</w:t>
+      </w:r>
+      <w:proofErr w:type="spellEnd"/>
+      <w:r>
+        <w:t xml:space="preserve"> </w:t>
+      </w:r>
+      <w:proofErr w:type="spellStart"/>
+      <w:r>
+        <w:t>tính</w:t>
+      </w:r>
+      <w:proofErr w:type="spellEnd"/>
+      <w:r>
+        <w:t>: Watt) (1đ)</w:t>
       </w:r>
     </w:p>
     <w:p>
@@ -111,7 +1056,23 @@
         <w:jc w:val="both"/>
       </w:pPr>
       <w:r>
-        <w:t>- Các phương thức: (2đ)</w:t>
+        <w:t xml:space="preserve">- Các </w:t>
+      </w:r>
+      <w:proofErr w:type="spellStart"/>
+      <w:r>
+        <w:t>phương</w:t>
+      </w:r>
+      <w:proofErr w:type="spellEnd"/>
+      <w:r>
+        <w:t xml:space="preserve"> </w:t>
+      </w:r>
+      <w:proofErr w:type="spellStart"/>
+      <w:r>
+        <w:t>thức</w:t>
+      </w:r>
+      <w:proofErr w:type="spellEnd"/>
+      <w:r>
+        <w:t>: (2đ)</w:t>
       </w:r>
     </w:p>
     <w:p>
@@ -121,8 +1082,157 @@
       </w:pPr>
       <w:r>
         <w:tab/>
-        <w:t>+ Thiết lập, Nhap(), Xuat(): Trong đó phương thức Nhap(), Xuat() ẩn đi phương thức cùng tên của lớp cơ sở</w:t>
-      </w:r>
+        <w:t xml:space="preserve">+ </w:t>
+      </w:r>
+      <w:proofErr w:type="spellStart"/>
+      <w:r>
+        <w:t>Thiết</w:t>
+      </w:r>
+      <w:proofErr w:type="spellEnd"/>
+      <w:r>
+        <w:t xml:space="preserve"> </w:t>
+      </w:r>
+      <w:proofErr w:type="spellStart"/>
+      <w:r>
+        <w:t>lập</w:t>
+      </w:r>
+      <w:proofErr w:type="spellEnd"/>
+      <w:r>
+        <w:t xml:space="preserve">, </w:t>
+      </w:r>
+      <w:proofErr w:type="spellStart"/>
+      <w:r>
+        <w:t>Nhap</w:t>
+      </w:r>
+      <w:proofErr w:type="spellEnd"/>
+      <w:r>
+        <w:t xml:space="preserve">(), </w:t>
+      </w:r>
+      <w:proofErr w:type="spellStart"/>
+      <w:r>
+        <w:t>Xuat</w:t>
+      </w:r>
+      <w:proofErr w:type="spellEnd"/>
+      <w:r>
+        <w:t xml:space="preserve">(): Trong </w:t>
+      </w:r>
+      <w:proofErr w:type="spellStart"/>
+      <w:r>
+        <w:t>đó</w:t>
+      </w:r>
+      <w:proofErr w:type="spellEnd"/>
+      <w:r>
+        <w:t xml:space="preserve"> </w:t>
+      </w:r>
+      <w:proofErr w:type="spellStart"/>
+      <w:r>
+        <w:t>phương</w:t>
+      </w:r>
+      <w:proofErr w:type="spellEnd"/>
+      <w:r>
+        <w:t xml:space="preserve"> </w:t>
+      </w:r>
+      <w:proofErr w:type="spellStart"/>
+      <w:r>
+        <w:t>thức</w:t>
+      </w:r>
+      <w:proofErr w:type="spellEnd"/>
+      <w:r>
+        <w:t xml:space="preserve"> </w:t>
+      </w:r>
+      <w:proofErr w:type="spellStart"/>
+      <w:r>
+        <w:t>Nhap</w:t>
+      </w:r>
+      <w:proofErr w:type="spellEnd"/>
+      <w:r>
+        <w:t xml:space="preserve">(), </w:t>
+      </w:r>
+      <w:proofErr w:type="spellStart"/>
+      <w:r>
+        <w:t>Xuat</w:t>
+      </w:r>
+      <w:proofErr w:type="spellEnd"/>
+      <w:r>
+        <w:t xml:space="preserve">() </w:t>
+      </w:r>
+      <w:proofErr w:type="spellStart"/>
+      <w:r>
+        <w:t>ẩn</w:t>
+      </w:r>
+      <w:proofErr w:type="spellEnd"/>
+      <w:r>
+        <w:t xml:space="preserve"> </w:t>
+      </w:r>
+      <w:proofErr w:type="spellStart"/>
+      <w:r>
+        <w:t>đi</w:t>
+      </w:r>
+      <w:proofErr w:type="spellEnd"/>
+      <w:r>
+        <w:t xml:space="preserve"> </w:t>
+      </w:r>
+      <w:proofErr w:type="spellStart"/>
+      <w:r>
+        <w:t>phương</w:t>
+      </w:r>
+      <w:proofErr w:type="spellEnd"/>
+      <w:r>
+        <w:t xml:space="preserve"> </w:t>
+      </w:r>
+      <w:proofErr w:type="spellStart"/>
+      <w:r>
+        <w:t>thức</w:t>
+      </w:r>
+      <w:proofErr w:type="spellEnd"/>
+      <w:r>
+        <w:t xml:space="preserve"> </w:t>
+      </w:r>
+      <w:proofErr w:type="spellStart"/>
+      <w:r>
+        <w:t>cùng</w:t>
+      </w:r>
+      <w:proofErr w:type="spellEnd"/>
+      <w:r>
+        <w:t xml:space="preserve"> </w:t>
+      </w:r>
+      <w:proofErr w:type="spellStart"/>
+      <w:r>
+        <w:t>tên</w:t>
+      </w:r>
+      <w:proofErr w:type="spellEnd"/>
+      <w:r>
+        <w:t xml:space="preserve"> </w:t>
+      </w:r>
+      <w:proofErr w:type="spellStart"/>
+      <w:r>
+        <w:t>của</w:t>
+      </w:r>
+      <w:proofErr w:type="spellEnd"/>
+      <w:r>
+        <w:t xml:space="preserve"> </w:t>
+      </w:r>
+      <w:proofErr w:type="spellStart"/>
+      <w:r>
+        <w:t>lớp</w:t>
+      </w:r>
+      <w:proofErr w:type="spellEnd"/>
+      <w:r>
+        <w:t xml:space="preserve"> </w:t>
+      </w:r>
+      <w:proofErr w:type="spellStart"/>
+      <w:r>
+        <w:t>cơ</w:t>
+      </w:r>
+      <w:proofErr w:type="spellEnd"/>
+      <w:r>
+        <w:t xml:space="preserve"> </w:t>
+      </w:r>
+      <w:proofErr w:type="spellStart"/>
+      <w:r>
+        <w:t>sở</w:t>
+      </w:r>
+      <w:proofErr w:type="spellEnd"/>
     </w:p>
     <w:p>
       <w:pPr>
@@ -131,15 +1241,252 @@
       </w:pPr>
       <w:r>
         <w:tab/>
-        <w:t>+ ThoiHanSuDung(), là phương thức ghi đè tính thời hạn sử dụng còn lại của xe điện theo công thức sau:</w:t>
+        <w:t xml:space="preserve">+ </w:t>
+      </w:r>
+      <w:proofErr w:type="spellStart"/>
+      <w:r>
+        <w:t>ThoiHanSuDung</w:t>
+      </w:r>
+      <w:proofErr w:type="spellEnd"/>
+      <w:r>
+        <w:t xml:space="preserve">(), </w:t>
+      </w:r>
+      <w:proofErr w:type="spellStart"/>
+      <w:r>
+        <w:t>là</w:t>
+      </w:r>
+      <w:proofErr w:type="spellEnd"/>
+      <w:r>
+        <w:t xml:space="preserve"> </w:t>
+      </w:r>
+      <w:proofErr w:type="spellStart"/>
+      <w:r>
+        <w:t>phương</w:t>
+      </w:r>
+      <w:proofErr w:type="spellEnd"/>
+      <w:r>
+        <w:t xml:space="preserve"> </w:t>
+      </w:r>
+      <w:proofErr w:type="spellStart"/>
+      <w:r>
+        <w:t>thức</w:t>
+      </w:r>
+      <w:proofErr w:type="spellEnd"/>
+      <w:r>
+        <w:t xml:space="preserve"> </w:t>
+      </w:r>
+      <w:proofErr w:type="spellStart"/>
+      <w:r>
+        <w:t>ghi</w:t>
+      </w:r>
+      <w:proofErr w:type="spellEnd"/>
+      <w:r>
+        <w:t xml:space="preserve"> </w:t>
+      </w:r>
+      <w:proofErr w:type="spellStart"/>
+      <w:r>
+        <w:t>đè</w:t>
+      </w:r>
+      <w:proofErr w:type="spellEnd"/>
+      <w:r>
+        <w:t xml:space="preserve"> </w:t>
+      </w:r>
+      <w:proofErr w:type="spellStart"/>
+      <w:r>
+        <w:t>tính</w:t>
+      </w:r>
+      <w:proofErr w:type="spellEnd"/>
+      <w:r>
+        <w:t xml:space="preserve"> </w:t>
+      </w:r>
+      <w:proofErr w:type="spellStart"/>
+      <w:r>
+        <w:t>thời</w:t>
+      </w:r>
+      <w:proofErr w:type="spellEnd"/>
+      <w:r>
+        <w:t xml:space="preserve"> </w:t>
+      </w:r>
+      <w:proofErr w:type="spellStart"/>
+      <w:r>
+        <w:t>hạn</w:t>
+      </w:r>
+      <w:proofErr w:type="spellEnd"/>
+      <w:r>
+        <w:t xml:space="preserve"> </w:t>
+      </w:r>
+      <w:proofErr w:type="spellStart"/>
+      <w:r>
+        <w:t>sử</w:t>
+      </w:r>
+      <w:proofErr w:type="spellEnd"/>
+      <w:r>
+        <w:t xml:space="preserve"> </w:t>
+      </w:r>
+      <w:proofErr w:type="spellStart"/>
+      <w:r>
+        <w:t>dụng</w:t>
+      </w:r>
+      <w:proofErr w:type="spellEnd"/>
+      <w:r>
+        <w:t xml:space="preserve"> </w:t>
+      </w:r>
+      <w:proofErr w:type="spellStart"/>
+      <w:r>
+        <w:t>còn</w:t>
+      </w:r>
+      <w:proofErr w:type="spellEnd"/>
+      <w:r>
+        <w:t xml:space="preserve"> </w:t>
+      </w:r>
+      <w:proofErr w:type="spellStart"/>
+      <w:r>
+        <w:t>lại</w:t>
+      </w:r>
+      <w:proofErr w:type="spellEnd"/>
+      <w:r>
+        <w:t xml:space="preserve"> </w:t>
+      </w:r>
+      <w:proofErr w:type="spellStart"/>
+      <w:r>
+        <w:t>của</w:t>
+      </w:r>
+      <w:proofErr w:type="spellEnd"/>
+      <w:r>
+        <w:t xml:space="preserve"> </w:t>
+      </w:r>
+      <w:proofErr w:type="spellStart"/>
+      <w:r>
+        <w:t>xe</w:t>
+      </w:r>
+      <w:proofErr w:type="spellEnd"/>
+      <w:r>
+        <w:t xml:space="preserve"> </w:t>
+      </w:r>
+      <w:proofErr w:type="spellStart"/>
+      <w:r>
+        <w:t>điện</w:t>
+      </w:r>
+      <w:proofErr w:type="spellEnd"/>
+      <w:r>
+        <w:t xml:space="preserve"> </w:t>
+      </w:r>
+      <w:proofErr w:type="spellStart"/>
+      <w:r>
+        <w:t>theo</w:t>
+      </w:r>
+      <w:proofErr w:type="spellEnd"/>
+      <w:r>
+        <w:t xml:space="preserve"> </w:t>
+      </w:r>
+      <w:proofErr w:type="spellStart"/>
+      <w:r>
+        <w:t>công</w:t>
+      </w:r>
+      <w:proofErr w:type="spellEnd"/>
+      <w:r>
+        <w:t xml:space="preserve"> </w:t>
+      </w:r>
+      <w:proofErr w:type="spellStart"/>
+      <w:r>
+        <w:t>thức</w:t>
+      </w:r>
+      <w:proofErr w:type="spellEnd"/>
+      <w:r>
+        <w:t xml:space="preserve"> </w:t>
+      </w:r>
+      <w:proofErr w:type="spellStart"/>
+      <w:r>
+        <w:t>sau</w:t>
+      </w:r>
+      <w:proofErr w:type="spellEnd"/>
+      <w:r>
+        <w:t>:</w:t>
       </w:r>
     </w:p>
     <w:p>
       <w:pPr>
         <w:ind w:firstLine="0"/>
       </w:pPr>
-      <w:r>
-        <w:t>Thời hạn sử dụng = THOIHAN – (năm hiện tại – năm sản xuất)</w:t>
+      <w:proofErr w:type="spellStart"/>
+      <w:r>
+        <w:t>Thời</w:t>
+      </w:r>
+      <w:proofErr w:type="spellEnd"/>
+      <w:r>
+        <w:t xml:space="preserve"> </w:t>
+      </w:r>
+      <w:proofErr w:type="spellStart"/>
+      <w:r>
+        <w:t>hạn</w:t>
+      </w:r>
+      <w:proofErr w:type="spellEnd"/>
+      <w:r>
+        <w:t xml:space="preserve"> </w:t>
+      </w:r>
+      <w:proofErr w:type="spellStart"/>
+      <w:r>
+        <w:t>sử</w:t>
+      </w:r>
+      <w:proofErr w:type="spellEnd"/>
+      <w:r>
+        <w:t xml:space="preserve"> </w:t>
+      </w:r>
+      <w:proofErr w:type="spellStart"/>
+      <w:r>
+        <w:t>dụng</w:t>
+      </w:r>
+      <w:proofErr w:type="spellEnd"/>
+      <w:r>
+        <w:t xml:space="preserve"> = THOIHAN – (</w:t>
+      </w:r>
+      <w:proofErr w:type="spellStart"/>
+      <w:r>
+        <w:t>năm</w:t>
+      </w:r>
+      <w:proofErr w:type="spellEnd"/>
+      <w:r>
+        <w:t xml:space="preserve"> </w:t>
+      </w:r>
+      <w:proofErr w:type="spellStart"/>
+      <w:r>
+        <w:t>hiện</w:t>
+      </w:r>
+      <w:proofErr w:type="spellEnd"/>
+      <w:r>
+        <w:t xml:space="preserve"> </w:t>
+      </w:r>
+      <w:proofErr w:type="spellStart"/>
+      <w:r>
+        <w:t>tại</w:t>
+      </w:r>
+      <w:proofErr w:type="spellEnd"/>
+      <w:r>
+        <w:t xml:space="preserve"> – </w:t>
+      </w:r>
+      <w:proofErr w:type="spellStart"/>
+      <w:r>
+        <w:t>năm</w:t>
+      </w:r>
+      <w:proofErr w:type="spellEnd"/>
+      <w:r>
+        <w:t xml:space="preserve"> </w:t>
+      </w:r>
+      <w:proofErr w:type="spellStart"/>
+      <w:r>
+        <w:t>sản</w:t>
+      </w:r>
+      <w:proofErr w:type="spellEnd"/>
+      <w:r>
+        <w:t xml:space="preserve"> </w:t>
+      </w:r>
+      <w:proofErr w:type="spellStart"/>
+      <w:r>
+        <w:t>xuất</w:t>
+      </w:r>
+      <w:proofErr w:type="spellEnd"/>
+      <w:r>
+        <w:t>)</w:t>
       </w:r>
     </w:p>
     <w:p>
@@ -159,7 +1506,183 @@
           <w:i/>
           <w:iCs/>
         </w:rPr>
-        <w:t>Trong đó, THOIHAN khai báo là hằng số và có giá trị là 10.</w:t>
+        <w:t xml:space="preserve">Trong </w:t>
+      </w:r>
+      <w:proofErr w:type="spellStart"/>
+      <w:r>
+        <w:rPr>
+          <w:i/>
+          <w:iCs/>
+        </w:rPr>
+        <w:t>đó</w:t>
+      </w:r>
+      <w:proofErr w:type="spellEnd"/>
+      <w:r>
+        <w:rPr>
+          <w:i/>
+          <w:iCs/>
+        </w:rPr>
+        <w:t xml:space="preserve">, THOIHAN </w:t>
+      </w:r>
+      <w:proofErr w:type="spellStart"/>
+      <w:r>
+        <w:rPr>
+          <w:i/>
+          <w:iCs/>
+        </w:rPr>
+        <w:t>khai</w:t>
+      </w:r>
+      <w:proofErr w:type="spellEnd"/>
+      <w:r>
+        <w:rPr>
+          <w:i/>
+          <w:iCs/>
+        </w:rPr>
+        <w:t xml:space="preserve"> </w:t>
+      </w:r>
+      <w:proofErr w:type="spellStart"/>
+      <w:r>
+        <w:rPr>
+          <w:i/>
+          <w:iCs/>
+        </w:rPr>
+        <w:t>báo</w:t>
+      </w:r>
+      <w:proofErr w:type="spellEnd"/>
+      <w:r>
+        <w:rPr>
+          <w:i/>
+          <w:iCs/>
+        </w:rPr>
+        <w:t xml:space="preserve"> </w:t>
+      </w:r>
+      <w:proofErr w:type="spellStart"/>
+      <w:r>
+        <w:rPr>
+          <w:i/>
+          <w:iCs/>
+        </w:rPr>
+        <w:t>là</w:t>
+      </w:r>
+      <w:proofErr w:type="spellEnd"/>
+      <w:r>
+        <w:rPr>
+          <w:i/>
+          <w:iCs/>
+        </w:rPr>
+        <w:t xml:space="preserve"> </w:t>
+      </w:r>
+      <w:proofErr w:type="spellStart"/>
+      <w:r>
+        <w:rPr>
+          <w:i/>
+          <w:iCs/>
+        </w:rPr>
+        <w:t>hằng</w:t>
+      </w:r>
+      <w:proofErr w:type="spellEnd"/>
+      <w:r>
+        <w:rPr>
+          <w:i/>
+          <w:iCs/>
+        </w:rPr>
+        <w:t xml:space="preserve"> </w:t>
+      </w:r>
+      <w:proofErr w:type="spellStart"/>
+      <w:r>
+        <w:rPr>
+          <w:i/>
+          <w:iCs/>
+        </w:rPr>
+        <w:t>số</w:t>
+      </w:r>
+      <w:proofErr w:type="spellEnd"/>
+      <w:r>
+        <w:rPr>
+          <w:i/>
+          <w:iCs/>
+        </w:rPr>
+        <w:t xml:space="preserve"> </w:t>
+      </w:r>
+      <w:proofErr w:type="spellStart"/>
+      <w:r>
+        <w:rPr>
+          <w:i/>
+          <w:iCs/>
+        </w:rPr>
+        <w:t>và</w:t>
+      </w:r>
+      <w:proofErr w:type="spellEnd"/>
+      <w:r>
+        <w:rPr>
+          <w:i/>
+          <w:iCs/>
+        </w:rPr>
+        <w:t xml:space="preserve"> </w:t>
+      </w:r>
+      <w:proofErr w:type="spellStart"/>
+      <w:r>
+        <w:rPr>
+          <w:i/>
+          <w:iCs/>
+        </w:rPr>
+        <w:t>có</w:t>
+      </w:r>
+      <w:proofErr w:type="spellEnd"/>
+      <w:r>
+        <w:rPr>
+          <w:i/>
+          <w:iCs/>
+        </w:rPr>
+        <w:t xml:space="preserve"> </w:t>
+      </w:r>
+      <w:proofErr w:type="spellStart"/>
+      <w:r>
+        <w:rPr>
+          <w:i/>
+          <w:iCs/>
+        </w:rPr>
+        <w:t>giá</w:t>
+      </w:r>
+      <w:proofErr w:type="spellEnd"/>
+      <w:r>
+        <w:rPr>
+          <w:i/>
+          <w:iCs/>
+        </w:rPr>
+        <w:t xml:space="preserve"> </w:t>
+      </w:r>
+      <w:proofErr w:type="spellStart"/>
+      <w:r>
+        <w:rPr>
+          <w:i/>
+          <w:iCs/>
+        </w:rPr>
+        <w:t>trị</w:t>
+      </w:r>
+      <w:proofErr w:type="spellEnd"/>
+      <w:r>
+        <w:rPr>
+          <w:i/>
+          <w:iCs/>
+        </w:rPr>
+        <w:t xml:space="preserve"> </w:t>
+      </w:r>
+      <w:proofErr w:type="spellStart"/>
+      <w:r>
+        <w:rPr>
+          <w:i/>
+          <w:iCs/>
+        </w:rPr>
+        <w:t>là</w:t>
+      </w:r>
+      <w:proofErr w:type="spellEnd"/>
+      <w:r>
+        <w:rPr>
+          <w:i/>
+          <w:iCs/>
+        </w:rPr>
+        <w:t xml:space="preserve"> 10.</w:t>
       </w:r>
     </w:p>
     <w:p>
@@ -168,7 +1691,31 @@
         <w:jc w:val="left"/>
       </w:pPr>
       <w:r>
-        <w:t>II. Chương trình chính (4đ)</w:t>
+        <w:t xml:space="preserve">II. </w:t>
+      </w:r>
+      <w:proofErr w:type="spellStart"/>
+      <w:r>
+        <w:t>Chương</w:t>
+      </w:r>
+      <w:proofErr w:type="spellEnd"/>
+      <w:r>
+        <w:t xml:space="preserve"> </w:t>
+      </w:r>
+      <w:proofErr w:type="spellStart"/>
+      <w:r>
+        <w:t>trình</w:t>
+      </w:r>
+      <w:proofErr w:type="spellEnd"/>
+      <w:r>
+        <w:t xml:space="preserve"> </w:t>
+      </w:r>
+      <w:proofErr w:type="spellStart"/>
+      <w:r>
+        <w:t>chính</w:t>
+      </w:r>
+      <w:proofErr w:type="spellEnd"/>
+      <w:r>
+        <w:t xml:space="preserve"> (4đ)</w:t>
       </w:r>
     </w:p>
     <w:p>
@@ -177,8 +1724,61 @@
         <w:jc w:val="left"/>
       </w:pPr>
       <w:r>
-        <w:t>- Nhập/tạo một danh sách xe điện</w:t>
-      </w:r>
+        <w:t xml:space="preserve">- </w:t>
+      </w:r>
+      <w:proofErr w:type="spellStart"/>
+      <w:r>
+        <w:t>Nhập</w:t>
+      </w:r>
+      <w:proofErr w:type="spellEnd"/>
+      <w:r>
+        <w:t>/</w:t>
+      </w:r>
+      <w:proofErr w:type="spellStart"/>
+      <w:r>
+        <w:t>tạo</w:t>
+      </w:r>
+      <w:proofErr w:type="spellEnd"/>
+      <w:r>
+        <w:t xml:space="preserve"> </w:t>
+      </w:r>
+      <w:proofErr w:type="spellStart"/>
+      <w:r>
+        <w:t>một</w:t>
+      </w:r>
+      <w:proofErr w:type="spellEnd"/>
+      <w:r>
+        <w:t xml:space="preserve"> </w:t>
+      </w:r>
+      <w:proofErr w:type="spellStart"/>
+      <w:r>
+        <w:t>danh</w:t>
+      </w:r>
+      <w:proofErr w:type="spellEnd"/>
+      <w:r>
+        <w:t xml:space="preserve"> </w:t>
+      </w:r>
+      <w:proofErr w:type="spellStart"/>
+      <w:r>
+        <w:t>sách</w:t>
+      </w:r>
+      <w:proofErr w:type="spellEnd"/>
+      <w:r>
+        <w:t xml:space="preserve"> </w:t>
+      </w:r>
+      <w:proofErr w:type="spellStart"/>
+      <w:r>
+        <w:t>xe</w:t>
+      </w:r>
+      <w:proofErr w:type="spellEnd"/>
+      <w:r>
+        <w:t xml:space="preserve"> </w:t>
+      </w:r>
+      <w:proofErr w:type="spellStart"/>
+      <w:r>
+        <w:t>điện</w:t>
+      </w:r>
+      <w:proofErr w:type="spellEnd"/>
     </w:p>
     <w:p>
       <w:pPr>
@@ -186,8 +1786,69 @@
         <w:jc w:val="left"/>
       </w:pPr>
       <w:r>
-        <w:t>- In danh sách xe vừa nhập và thông tin chi tiết</w:t>
-      </w:r>
+        <w:t xml:space="preserve">- In </w:t>
+      </w:r>
+      <w:proofErr w:type="spellStart"/>
+      <w:r>
+        <w:t>danh</w:t>
+      </w:r>
+      <w:proofErr w:type="spellEnd"/>
+      <w:r>
+        <w:t xml:space="preserve"> </w:t>
+      </w:r>
+      <w:proofErr w:type="spellStart"/>
+      <w:r>
+        <w:t>sách</w:t>
+      </w:r>
+      <w:proofErr w:type="spellEnd"/>
+      <w:r>
+        <w:t xml:space="preserve"> </w:t>
+      </w:r>
+      <w:proofErr w:type="spellStart"/>
+      <w:r>
+        <w:t>xe</w:t>
+      </w:r>
+      <w:proofErr w:type="spellEnd"/>
+      <w:r>
+        <w:t xml:space="preserve"> </w:t>
+      </w:r>
+      <w:proofErr w:type="spellStart"/>
+      <w:r>
+        <w:t>vừa</w:t>
+      </w:r>
+      <w:proofErr w:type="spellEnd"/>
+      <w:r>
+        <w:t xml:space="preserve"> </w:t>
+      </w:r>
+      <w:proofErr w:type="spellStart"/>
+      <w:r>
+        <w:t>nhập</w:t>
+      </w:r>
+      <w:proofErr w:type="spellEnd"/>
+      <w:r>
+        <w:t xml:space="preserve"> </w:t>
+      </w:r>
+      <w:proofErr w:type="spellStart"/>
+      <w:r>
+        <w:t>và</w:t>
+      </w:r>
+      <w:proofErr w:type="spellEnd"/>
+      <w:r>
+        <w:t xml:space="preserve"> </w:t>
+      </w:r>
+      <w:proofErr w:type="spellStart"/>
+      <w:r>
+        <w:t>thông</w:t>
+      </w:r>
+      <w:proofErr w:type="spellEnd"/>
+      <w:r>
+        <w:t xml:space="preserve"> tin chi </w:t>
+      </w:r>
+      <w:proofErr w:type="spellStart"/>
+      <w:r>
+        <w:t>tiết</w:t>
+      </w:r>
+      <w:proofErr w:type="spellEnd"/>
     </w:p>
     <w:p>
       <w:pPr>
@@ -195,8 +1856,101 @@
         <w:jc w:val="left"/>
       </w:pPr>
       <w:r>
-        <w:t>- Sắp xếp danh sách xe theo thời hạn sử dụng giảm dần</w:t>
-      </w:r>
+        <w:t xml:space="preserve">- </w:t>
+      </w:r>
+      <w:proofErr w:type="spellStart"/>
+      <w:r>
+        <w:t>Sắp</w:t>
+      </w:r>
+      <w:proofErr w:type="spellEnd"/>
+      <w:r>
+        <w:t xml:space="preserve"> </w:t>
+      </w:r>
+      <w:proofErr w:type="spellStart"/>
+      <w:r>
+        <w:t>xếp</w:t>
+      </w:r>
+      <w:proofErr w:type="spellEnd"/>
+      <w:r>
+        <w:t xml:space="preserve"> </w:t>
+      </w:r>
+      <w:proofErr w:type="spellStart"/>
+      <w:r>
+        <w:t>danh</w:t>
+      </w:r>
+      <w:proofErr w:type="spellEnd"/>
+      <w:r>
+        <w:t xml:space="preserve"> </w:t>
+      </w:r>
+      <w:proofErr w:type="spellStart"/>
+      <w:r>
+        <w:t>sách</w:t>
+      </w:r>
+      <w:proofErr w:type="spellEnd"/>
+      <w:r>
+        <w:t xml:space="preserve"> </w:t>
+      </w:r>
+      <w:proofErr w:type="spellStart"/>
+      <w:r>
+        <w:t>xe</w:t>
+      </w:r>
+      <w:proofErr w:type="spellEnd"/>
+      <w:r>
+        <w:t xml:space="preserve"> </w:t>
+      </w:r>
+      <w:proofErr w:type="spellStart"/>
+      <w:r>
+        <w:t>theo</w:t>
+      </w:r>
+      <w:proofErr w:type="spellEnd"/>
+      <w:r>
+        <w:t xml:space="preserve"> </w:t>
+      </w:r>
+      <w:proofErr w:type="spellStart"/>
+      <w:r>
+        <w:t>thời</w:t>
+      </w:r>
+      <w:proofErr w:type="spellEnd"/>
+      <w:r>
+        <w:t xml:space="preserve"> </w:t>
+      </w:r>
+      <w:proofErr w:type="spellStart"/>
+      <w:r>
+        <w:t>hạn</w:t>
+      </w:r>
+      <w:proofErr w:type="spellEnd"/>
+      <w:r>
+        <w:t xml:space="preserve"> </w:t>
+      </w:r>
+      <w:proofErr w:type="spellStart"/>
+      <w:r>
+        <w:t>sử</w:t>
+      </w:r>
+      <w:proofErr w:type="spellEnd"/>
+      <w:r>
+        <w:t xml:space="preserve"> </w:t>
+      </w:r>
+      <w:proofErr w:type="spellStart"/>
+      <w:r>
+        <w:t>dụng</w:t>
+      </w:r>
+      <w:proofErr w:type="spellEnd"/>
+      <w:r>
+        <w:t xml:space="preserve"> </w:t>
+      </w:r>
+      <w:proofErr w:type="spellStart"/>
+      <w:r>
+        <w:t>giảm</w:t>
+      </w:r>
+      <w:proofErr w:type="spellEnd"/>
+      <w:r>
+        <w:t xml:space="preserve"> </w:t>
+      </w:r>
+      <w:proofErr w:type="spellStart"/>
+      <w:r>
+        <w:t>dần</w:t>
+      </w:r>
+      <w:proofErr w:type="spellEnd"/>
     </w:p>
     <w:p>
       <w:pPr>
@@ -204,8 +1958,77 @@
         <w:jc w:val="left"/>
       </w:pPr>
       <w:r>
-        <w:t>- Liệt kê các xe hết thời hạn sử dụng</w:t>
-      </w:r>
+        <w:t xml:space="preserve">- </w:t>
+      </w:r>
+      <w:proofErr w:type="spellStart"/>
+      <w:r>
+        <w:t>Liệt</w:t>
+      </w:r>
+      <w:proofErr w:type="spellEnd"/>
+      <w:r>
+        <w:t xml:space="preserve"> </w:t>
+      </w:r>
+      <w:proofErr w:type="spellStart"/>
+      <w:r>
+        <w:t>kê</w:t>
+      </w:r>
+      <w:proofErr w:type="spellEnd"/>
+      <w:r>
+        <w:t xml:space="preserve"> </w:t>
+      </w:r>
+      <w:proofErr w:type="spellStart"/>
+      <w:r>
+        <w:t>các</w:t>
+      </w:r>
+      <w:proofErr w:type="spellEnd"/>
+      <w:r>
+        <w:t xml:space="preserve"> </w:t>
+      </w:r>
+      <w:proofErr w:type="spellStart"/>
+      <w:r>
+        <w:t>xe</w:t>
+      </w:r>
+      <w:proofErr w:type="spellEnd"/>
+      <w:r>
+        <w:t xml:space="preserve"> </w:t>
+      </w:r>
+      <w:proofErr w:type="spellStart"/>
+      <w:r>
+        <w:t>hết</w:t>
+      </w:r>
+      <w:proofErr w:type="spellEnd"/>
+      <w:r>
+        <w:t xml:space="preserve"> </w:t>
+      </w:r>
+      <w:proofErr w:type="spellStart"/>
+      <w:r>
+        <w:t>thời</w:t>
+      </w:r>
+      <w:proofErr w:type="spellEnd"/>
+      <w:r>
+        <w:t xml:space="preserve"> </w:t>
+      </w:r>
+      <w:proofErr w:type="spellStart"/>
+      <w:r>
+        <w:t>hạn</w:t>
+      </w:r>
+      <w:proofErr w:type="spellEnd"/>
+      <w:r>
+        <w:t xml:space="preserve"> </w:t>
+      </w:r>
+      <w:proofErr w:type="spellStart"/>
+      <w:r>
+        <w:t>sử</w:t>
+      </w:r>
+      <w:proofErr w:type="spellEnd"/>
+      <w:r>
+        <w:t xml:space="preserve"> </w:t>
+      </w:r>
+      <w:proofErr w:type="spellStart"/>
+      <w:r>
+        <w:t>dụng</w:t>
+      </w:r>
+      <w:proofErr w:type="spellEnd"/>
     </w:p>
     <w:sectPr>
       <w:pgSz w:w="11907" w:h="16840" w:code="9"/>

</xml_diff>